<commit_message>
docs: resolve shell working log branch note
</commit_message>
<xml_diff>
--- a/docs/m1-03-application-shell-working-log.docx
+++ b/docs/m1-03-application-shell-working-log.docx
@@ -1504,7 +1504,6 @@
             <w:r>
               <w:rPr>
                 <w:rFonts w:ascii="Arial" w:hAnsi="Arial"/>
-                <w:b w:val="0"/>
                 <w:sz w:val="18"/>
               </w:rPr>
               <w:t>P2</w:t>
@@ -1521,10 +1520,9 @@
             <w:r>
               <w:rPr>
                 <w:rFonts w:ascii="Arial" w:hAnsi="Arial"/>
-                <w:b w:val="0"/>
                 <w:sz w:val="18"/>
               </w:rPr>
-              <w:t>Previous branch feature/m1-03-responsive-shell had an unrelated unpushed dependency/Supabase commit.</w:t>
+              <w:t>Resolved branch hygiene concern: the earlier feature/m1-03-responsive-shell branch contained an unrelated unpushed dependency/Supabase commit, so this work was moved to a clean feat/m1-responsive-shell branch from origin/main.</w:t>
             </w:r>
           </w:p>
         </w:tc>
@@ -1538,10 +1536,9 @@
             <w:r>
               <w:rPr>
                 <w:rFonts w:ascii="Arial" w:hAnsi="Arial"/>
-                <w:b w:val="0"/>
                 <w:sz w:val="18"/>
               </w:rPr>
-              <w:t>Avoided</w:t>
+              <w:t>Resolved for PR #45</w:t>
             </w:r>
           </w:p>
         </w:tc>
@@ -1555,10 +1552,9 @@
             <w:r>
               <w:rPr>
                 <w:rFonts w:ascii="Arial" w:hAnsi="Arial"/>
-                <w:b w:val="0"/>
                 <w:sz w:val="18"/>
               </w:rPr>
-              <w:t>Clean branch feat/m1-responsive-shell was created from origin/main.</w:t>
+              <w:t>No action is required for this PR. Do not delete or overwrite the older local branch without explicit approval because it contains separate unpushed work.</w:t>
             </w:r>
           </w:p>
         </w:tc>

</xml_diff>

<commit_message>
test: cover shell mobile navigation
</commit_message>
<xml_diff>
--- a/docs/m1-03-application-shell-working-log.docx
+++ b/docs/m1-03-application-shell-working-log.docx
@@ -1364,7 +1364,6 @@
             <w:r>
               <w:rPr>
                 <w:rFonts w:ascii="Arial" w:hAnsi="Arial"/>
-                <w:b w:val="0"/>
                 <w:sz w:val="18"/>
               </w:rPr>
               <w:t>P1</w:t>
@@ -1381,7 +1380,6 @@
             <w:r>
               <w:rPr>
                 <w:rFonts w:ascii="Arial" w:hAnsi="Arial"/>
-                <w:b w:val="0"/>
                 <w:sz w:val="18"/>
               </w:rPr>
               <w:t>Storybook full static manager build fails in this restricted Windows execution context.</w:t>
@@ -1398,10 +1396,9 @@
             <w:r>
               <w:rPr>
                 <w:rFonts w:ascii="Arial" w:hAnsi="Arial"/>
-                <w:b w:val="0"/>
                 <w:sz w:val="18"/>
               </w:rPr>
-              <w:t>Open</w:t>
+              <w:t>Tracked in GitHub issue #46</w:t>
             </w:r>
           </w:p>
         </w:tc>
@@ -1415,10 +1412,9 @@
             <w:r>
               <w:rPr>
                 <w:rFonts w:ascii="Arial" w:hAnsi="Arial"/>
-                <w:b w:val="0"/>
                 <w:sz w:val="18"/>
               </w:rPr>
-              <w:t>Track separately or verify in unrestricted local terminal/CI; preview and browser story tests pass.</w:t>
+              <w:t>Issue #46 now owns unrestricted terminal/CI reproduction and any repo-owned manager-cache/root fix. Preview build and browser story tests remain passing evidence for PR #45.</w:t>
             </w:r>
           </w:p>
         </w:tc>
@@ -1434,7 +1430,6 @@
             <w:r>
               <w:rPr>
                 <w:rFonts w:ascii="Arial" w:hAnsi="Arial"/>
-                <w:b w:val="0"/>
                 <w:sz w:val="18"/>
               </w:rPr>
               <w:t>P1</w:t>
@@ -1451,7 +1446,6 @@
             <w:r>
               <w:rPr>
                 <w:rFonts w:ascii="Arial" w:hAnsi="Arial"/>
-                <w:b w:val="0"/>
                 <w:sz w:val="18"/>
               </w:rPr>
               <w:t>GitHub CLI authentication token is invalid for OhhttooeXCIV.</w:t>
@@ -1468,10 +1462,9 @@
             <w:r>
               <w:rPr>
                 <w:rFonts w:ascii="Arial" w:hAnsi="Arial"/>
-                <w:b w:val="0"/>
                 <w:sz w:val="18"/>
               </w:rPr>
-              <w:t>Open external blocker</w:t>
+              <w:t>Mitigated for PR #45</w:t>
             </w:r>
           </w:p>
         </w:tc>
@@ -1485,10 +1478,9 @@
             <w:r>
               <w:rPr>
                 <w:rFonts w:ascii="Arial" w:hAnsi="Arial"/>
-                <w:b w:val="0"/>
                 <w:sz w:val="18"/>
               </w:rPr>
-              <w:t>Use GitHub app connector for PR creation after push, or re-authenticate gh.</w:t>
+              <w:t>PR creation and issue tracking were completed through the GitHub app connector. Local gh re-authentication remains a user environment task, not a blocker for this PR.</w:t>
             </w:r>
           </w:p>
         </w:tc>
@@ -1570,7 +1562,6 @@
             <w:r>
               <w:rPr>
                 <w:rFonts w:ascii="Arial" w:hAnsi="Arial"/>
-                <w:b w:val="0"/>
                 <w:sz w:val="18"/>
               </w:rPr>
               <w:t>P2</w:t>
@@ -1587,7 +1578,6 @@
             <w:r>
               <w:rPr>
                 <w:rFonts w:ascii="Arial" w:hAnsi="Arial"/>
-                <w:b w:val="0"/>
                 <w:sz w:val="18"/>
               </w:rPr>
               <w:t>DOCX visual render QA is unavailable because soffice is missing.</w:t>
@@ -1604,10 +1594,9 @@
             <w:r>
               <w:rPr>
                 <w:rFonts w:ascii="Arial" w:hAnsi="Arial"/>
-                <w:b w:val="0"/>
                 <w:sz w:val="18"/>
               </w:rPr>
-              <w:t>Open environment limitation</w:t>
+              <w:t>Documented environment limitation</w:t>
             </w:r>
           </w:p>
         </w:tc>
@@ -1621,10 +1610,9 @@
             <w:r>
               <w:rPr>
                 <w:rFonts w:ascii="Arial" w:hAnsi="Arial"/>
-                <w:b w:val="0"/>
                 <w:sz w:val="18"/>
               </w:rPr>
-              <w:t>Install LibreOffice or run render_docx.py in an environment with soffice before treating layout as visually verified.</w:t>
+              <w:t>Structural DOCX audit passed. Install LibreOffice/soffice or run render_docx.py in an environment that provides soffice before treating layout as visually verified.</w:t>
             </w:r>
           </w:p>
         </w:tc>
@@ -1640,7 +1628,6 @@
             <w:r>
               <w:rPr>
                 <w:rFonts w:ascii="Arial" w:hAnsi="Arial"/>
-                <w:b w:val="0"/>
                 <w:sz w:val="18"/>
               </w:rPr>
               <w:t>P3</w:t>
@@ -1657,7 +1644,6 @@
             <w:r>
               <w:rPr>
                 <w:rFonts w:ascii="Arial" w:hAnsi="Arial"/>
-                <w:b w:val="0"/>
                 <w:sz w:val="18"/>
               </w:rPr>
               <w:t>Vitest config used deprecated test.workspace key.</w:t>
@@ -1674,7 +1660,6 @@
             <w:r>
               <w:rPr>
                 <w:rFonts w:ascii="Arial" w:hAnsi="Arial"/>
-                <w:b w:val="0"/>
                 <w:sz w:val="18"/>
               </w:rPr>
               <w:t>Resolved</w:t>
@@ -1691,10 +1676,9 @@
             <w:r>
               <w:rPr>
                 <w:rFonts w:ascii="Arial" w:hAnsi="Arial"/>
-                <w:b w:val="0"/>
                 <w:sz w:val="18"/>
               </w:rPr>
-              <w:t>Renamed to test.projects.</w:t>
+              <w:t>Renamed to test.projects and encoded --configLoader runner in npm test scripts.</w:t>
             </w:r>
           </w:p>
         </w:tc>
@@ -1713,40 +1697,65 @@
       <w:pPr>
         <w:pStyle w:val="ListBullet"/>
       </w:pPr>
+      <w:r/>
       <w:r>
-        <w:t>Add explicit mobile-menu interaction tests for ApplicationShell open, close, and link activation.</w:t>
+        <w:rPr>
+          <w:rFonts w:ascii="Arial" w:hAnsi="Arial"/>
+          <w:sz w:val="21"/>
+        </w:rPr>
+        <w:t>Applied: added a mobile-menu interaction test for open, active-route marking, link activation, and close behaviour.</w:t>
       </w:r>
     </w:p>
     <w:p>
       <w:pPr>
         <w:pStyle w:val="ListBullet"/>
       </w:pPr>
+      <w:r/>
       <w:r>
-        <w:t>Create a repo-owned Storybook full-build follow-up if CI reproduces the manager-cache error.</w:t>
+        <w:rPr>
+          <w:rFonts w:ascii="Arial" w:hAnsi="Arial"/>
+          <w:sz w:val="21"/>
+        </w:rPr>
+        <w:t>Applied: created GitHub issue #46 to verify/fix the Storybook full static manager build in CI or an unrestricted terminal.</w:t>
       </w:r>
     </w:p>
     <w:p>
       <w:pPr>
         <w:pStyle w:val="ListBullet"/>
       </w:pPr>
+      <w:r/>
       <w:r>
-        <w:t>Add a novice-facing architecture note mapping ApplicationShell, shell translations, route composition, tokens, and Storybook stories.</w:t>
+        <w:rPr>
+          <w:rFonts w:ascii="Arial" w:hAnsi="Arial"/>
+          <w:sz w:val="21"/>
+        </w:rPr>
+        <w:t>Applied: added docs/m1-application-shell-architecture.md mapping ApplicationShell, translations, route composition, tokens, Storybook, and verification.</w:t>
       </w:r>
     </w:p>
     <w:p>
       <w:pPr>
         <w:pStyle w:val="ListBullet"/>
       </w:pPr>
+      <w:r/>
       <w:r>
-        <w:t>Keep future issue branches one-issue-per-branch from latest main, using the branch name specified in the issue body.</w:t>
+        <w:rPr>
+          <w:rFonts w:ascii="Arial" w:hAnsi="Arial"/>
+          <w:sz w:val="21"/>
+        </w:rPr>
+        <w:t>Applied as branch protocol: PR #45 uses clean feat/m1-responsive-shell from origin/main; future issues should repeat this pattern.</w:t>
       </w:r>
     </w:p>
     <w:p>
       <w:pPr>
         <w:pStyle w:val="ListBullet"/>
       </w:pPr>
+      <w:r/>
       <w:r>
-        <w:t>Promote dev to preview and preview to main only after PR review/merge gates pass.</w:t>
+        <w:rPr>
+          <w:rFonts w:ascii="Arial" w:hAnsi="Arial"/>
+          <w:sz w:val="21"/>
+        </w:rPr>
+        <w:t>Kept as release gate: do not promote dev to preview or preview to main until PR review/merge gates pass.</w:t>
       </w:r>
     </w:p>
     <w:p>
@@ -1783,6 +1792,62 @@
     <w:p>
       <w:r>
         <w:t>Claims in this log are based on local repository inspection and command output from 2026-06-26. The GitHub issue list and PR state were read through the GitHub app connector; local gh CLI authentication was invalid.</w:t>
+      </w:r>
+    </w:p>
+    <w:p>
+      <w:pPr>
+        <w:pStyle w:val="Heading1"/>
+      </w:pPr>
+      <w:r>
+        <w:t>Application Pass Update</w:t>
+      </w:r>
+    </w:p>
+    <w:p>
+      <w:pPr>
+        <w:pStyle w:val="ListBullet"/>
+      </w:pPr>
+      <w:r>
+        <w:rPr>
+          <w:rFonts w:ascii="Arial" w:hAnsi="Arial"/>
+          <w:sz w:val="21"/>
+        </w:rPr>
+        <w:t>Mobile-menu behaviour test added to src/app/page.test.tsx.</w:t>
+      </w:r>
+    </w:p>
+    <w:p>
+      <w:pPr>
+        <w:pStyle w:val="ListBullet"/>
+      </w:pPr>
+      <w:r>
+        <w:rPr>
+          <w:rFonts w:ascii="Arial" w:hAnsi="Arial"/>
+          <w:sz w:val="21"/>
+        </w:rPr>
+        <w:t>Novice-facing architecture note added at docs/m1-application-shell-architecture.md.</w:t>
+      </w:r>
+    </w:p>
+    <w:p>
+      <w:pPr>
+        <w:pStyle w:val="ListBullet"/>
+      </w:pPr>
+      <w:r>
+        <w:rPr>
+          <w:rFonts w:ascii="Arial" w:hAnsi="Arial"/>
+          <w:sz w:val="21"/>
+        </w:rPr>
+        <w:t>Storybook full static manager-build follow-up created as GitHub issue #46.</w:t>
+      </w:r>
+    </w:p>
+    <w:p>
+      <w:pPr>
+        <w:pStyle w:val="ListBullet"/>
+      </w:pPr>
+      <w:r>
+        <w:rPr>
+          <w:rFonts w:ascii="Arial" w:hAnsi="Arial"/>
+          <w:sz w:val="21"/>
+        </w:rPr>
+        <w:t>PR #45 remains the draft PR into dev for issue #24; branch deletion and dev -&gt; preview -&gt; main promotion remain post-merge gates.</w:t>
       </w:r>
     </w:p>
     <w:sectPr>

</xml_diff>